<commit_message>
Update the project report - rewrite the project report to use the latest UI changes - ensure all screenshots reflect the new design - verify that all sections are up to date with recent developments - Add the "Future Improvements" section to the project report
</commit_message>
<xml_diff>
--- a/Currency converter project report.docx
+++ b/Currency converter project report.docx
@@ -2040,6 +2040,28 @@
           <w:sz w:val="28"/>
           <w:szCs w:val="28"/>
         </w:rPr>
+        <w:br w:type="page"/>
+      </w:r>
+    </w:p>
+    <w:p>
+      <w:pPr>
+        <w:rPr>
+          <w:rFonts w:ascii="Times New Roman" w:hAnsi="Times New Roman" w:cs="Times New Roman"/>
+          <w:b/>
+          <w:bCs/>
+          <w:sz w:val="28"/>
+          <w:szCs w:val="28"/>
+        </w:rPr>
+      </w:pPr>
+      <w:r>
+        <w:rPr>
+          <w:rFonts w:ascii="Times New Roman" w:hAnsi="Times New Roman" w:cs="Times New Roman"/>
+          <w:b/>
+          <w:bCs/>
+          <w:sz w:val="28"/>
+          <w:szCs w:val="28"/>
+        </w:rPr>
+        <w:lastRenderedPageBreak/>
         <w:t>T</w:t>
       </w:r>
       <w:r>
@@ -2147,7 +2169,6 @@
           <w:sz w:val="26"/>
           <w:szCs w:val="26"/>
         </w:rPr>
-        <w:lastRenderedPageBreak/>
         <w:t>JSON Processing Library (</w:t>
       </w:r>
       <w:proofErr w:type="spellStart"/>
@@ -2798,6 +2819,214 @@
         </w:rPr>
         <w:t>Internet Connection: Required for fetching live exchange rates (one-time per session)</w:t>
       </w:r>
+    </w:p>
+    <w:p>
+      <w:pPr>
+        <w:rPr>
+          <w:rFonts w:ascii="Times New Roman" w:hAnsi="Times New Roman" w:cs="Times New Roman"/>
+          <w:b/>
+          <w:bCs/>
+          <w:sz w:val="28"/>
+          <w:szCs w:val="28"/>
+        </w:rPr>
+      </w:pPr>
+      <w:r>
+        <w:rPr>
+          <w:rFonts w:ascii="Times New Roman" w:hAnsi="Times New Roman" w:cs="Times New Roman"/>
+          <w:b/>
+          <w:bCs/>
+          <w:sz w:val="28"/>
+          <w:szCs w:val="28"/>
+        </w:rPr>
+        <w:br w:type="page"/>
+      </w:r>
+    </w:p>
+    <w:p>
+      <w:pPr>
+        <w:rPr>
+          <w:rFonts w:ascii="Times New Roman" w:hAnsi="Times New Roman" w:cs="Times New Roman"/>
+          <w:b/>
+          <w:bCs/>
+          <w:sz w:val="28"/>
+          <w:szCs w:val="28"/>
+        </w:rPr>
+      </w:pPr>
+      <w:r>
+        <w:rPr>
+          <w:rFonts w:ascii="Times New Roman" w:hAnsi="Times New Roman" w:cs="Times New Roman"/>
+          <w:b/>
+          <w:bCs/>
+          <w:sz w:val="28"/>
+          <w:szCs w:val="28"/>
+        </w:rPr>
+        <w:lastRenderedPageBreak/>
+        <w:t>FUTURE IMPROVEMENT</w:t>
+      </w:r>
+    </w:p>
+    <w:p>
+      <w:pPr>
+        <w:jc w:val="both"/>
+        <w:rPr>
+          <w:rFonts w:ascii="Times New Roman" w:hAnsi="Times New Roman" w:cs="Times New Roman"/>
+          <w:sz w:val="26"/>
+          <w:szCs w:val="26"/>
+        </w:rPr>
+      </w:pPr>
+      <w:r>
+        <w:rPr>
+          <w:rStyle w:val="Strong"/>
+          <w:rFonts w:ascii="Times New Roman" w:hAnsi="Times New Roman" w:cs="Times New Roman"/>
+          <w:sz w:val="26"/>
+          <w:szCs w:val="26"/>
+        </w:rPr>
+        <w:t>Cryptocurrency Support</w:t>
+      </w:r>
+      <w:r>
+        <w:rPr>
+          <w:rFonts w:ascii="Times New Roman" w:hAnsi="Times New Roman" w:cs="Times New Roman"/>
+          <w:sz w:val="26"/>
+          <w:szCs w:val="26"/>
+        </w:rPr>
+        <w:t>: Add support for converting between cryptocurrencies (Bitcoin, Ethereum, etc.) alongside traditional fiat currencies by integrating a cryptocurrency API.</w:t>
+      </w:r>
+    </w:p>
+    <w:p>
+      <w:pPr>
+        <w:pStyle w:val="NormalWeb"/>
+        <w:jc w:val="both"/>
+        <w:rPr>
+          <w:sz w:val="26"/>
+          <w:szCs w:val="26"/>
+        </w:rPr>
+      </w:pPr>
+      <w:r>
+        <w:rPr>
+          <w:rStyle w:val="Strong"/>
+          <w:sz w:val="26"/>
+          <w:szCs w:val="26"/>
+        </w:rPr>
+        <w:t>Conversion History</w:t>
+      </w:r>
+      <w:r>
+        <w:rPr>
+          <w:sz w:val="26"/>
+          <w:szCs w:val="26"/>
+        </w:rPr>
+        <w:t>: Maintain a log of recent conversions that users can quickly access and repeat without re-entering data.</w:t>
+      </w:r>
+    </w:p>
+    <w:p>
+      <w:pPr>
+        <w:pStyle w:val="NormalWeb"/>
+        <w:jc w:val="both"/>
+        <w:rPr>
+          <w:sz w:val="26"/>
+          <w:szCs w:val="26"/>
+        </w:rPr>
+      </w:pPr>
+      <w:r>
+        <w:rPr>
+          <w:rStyle w:val="Strong"/>
+          <w:sz w:val="26"/>
+          <w:szCs w:val="26"/>
+        </w:rPr>
+        <w:t>Favorite Currencies</w:t>
+      </w:r>
+      <w:r>
+        <w:rPr>
+          <w:sz w:val="26"/>
+          <w:szCs w:val="26"/>
+        </w:rPr>
+        <w:t>: Allow users to save their most frequently used currency pairs for faster access and improved workflow.</w:t>
+      </w:r>
+    </w:p>
+    <w:p>
+      <w:pPr>
+        <w:pStyle w:val="NormalWeb"/>
+        <w:jc w:val="both"/>
+        <w:rPr>
+          <w:sz w:val="26"/>
+          <w:szCs w:val="26"/>
+        </w:rPr>
+      </w:pPr>
+      <w:r>
+        <w:rPr>
+          <w:rStyle w:val="Strong"/>
+          <w:sz w:val="26"/>
+          <w:szCs w:val="26"/>
+        </w:rPr>
+        <w:t>Offline Mode</w:t>
+      </w:r>
+      <w:r>
+        <w:rPr>
+          <w:sz w:val="26"/>
+          <w:szCs w:val="26"/>
+        </w:rPr>
+        <w:t>: Cache exchange rates locally so conversions can continue even when internet connection is temporarily unavailable.</w:t>
+      </w:r>
+    </w:p>
+    <w:p>
+      <w:pPr>
+        <w:pStyle w:val="NormalWeb"/>
+        <w:jc w:val="both"/>
+        <w:rPr>
+          <w:sz w:val="26"/>
+          <w:szCs w:val="26"/>
+        </w:rPr>
+      </w:pPr>
+      <w:r>
+        <w:rPr>
+          <w:rStyle w:val="Strong"/>
+          <w:sz w:val="26"/>
+          <w:szCs w:val="26"/>
+        </w:rPr>
+        <w:t>Copy Result Button</w:t>
+      </w:r>
+      <w:r>
+        <w:rPr>
+          <w:sz w:val="26"/>
+          <w:szCs w:val="26"/>
+        </w:rPr>
+        <w:t>: Add a dedicated button to easily copy the conversion result to clipboard for pasting into other applications.</w:t>
+      </w:r>
+    </w:p>
+    <w:p>
+      <w:pPr>
+        <w:pStyle w:val="NormalWeb"/>
+        <w:jc w:val="both"/>
+        <w:rPr>
+          <w:sz w:val="26"/>
+          <w:szCs w:val="26"/>
+        </w:rPr>
+      </w:pPr>
+      <w:r>
+        <w:rPr>
+          <w:rStyle w:val="Strong"/>
+          <w:sz w:val="26"/>
+          <w:szCs w:val="26"/>
+        </w:rPr>
+        <w:t>Exchange Rate Trends</w:t>
+      </w:r>
+      <w:r>
+        <w:rPr>
+          <w:sz w:val="26"/>
+          <w:szCs w:val="26"/>
+        </w:rPr>
+        <w:t>: Display historical exchange rate changes and trends to help users understand market movements.</w:t>
+      </w:r>
+    </w:p>
+    <w:p>
+      <w:pPr>
+        <w:spacing w:before="100" w:beforeAutospacing="1" w:after="100" w:afterAutospacing="1" w:line="276" w:lineRule="auto"/>
+        <w:jc w:val="both"/>
+        <w:rPr>
+          <w:rFonts w:ascii="Times New Roman" w:eastAsia="Times New Roman" w:hAnsi="Times New Roman" w:cs="Times New Roman"/>
+          <w:b/>
+          <w:bCs/>
+          <w:sz w:val="26"/>
+          <w:szCs w:val="26"/>
+        </w:rPr>
+      </w:pPr>
     </w:p>
     <w:p>
       <w:pPr>
@@ -3474,18 +3703,34 @@
       </w:pPr>
       <w:r>
         <w:rPr>
-          <w:rStyle w:val="Strong"/>
-          <w:sz w:val="26"/>
-          <w:szCs w:val="26"/>
-        </w:rPr>
-        <w:t>Amount Input Field</w:t>
-      </w:r>
-      <w:r>
-        <w:rPr>
-          <w:sz w:val="26"/>
-          <w:szCs w:val="26"/>
-        </w:rPr>
-        <w:t>: We created a text input field labeled "Amount" with a default value of 1. This field accepts numeric input that users can modify to specify the quantity of currency they wish to convert. The field is positioned centrally for easy access.</w:t>
+          <w:b/>
+          <w:bCs/>
+          <w:sz w:val="26"/>
+          <w:szCs w:val="26"/>
+        </w:rPr>
+        <w:t xml:space="preserve">Swap Button: </w:t>
+      </w:r>
+      <w:r>
+        <w:rPr>
+          <w:sz w:val="26"/>
+          <w:szCs w:val="26"/>
+        </w:rPr>
+        <w:t>We created a swap button with the icon “</w:t>
+      </w:r>
+      <w:r>
+        <w:rPr>
+          <w:rFonts w:ascii="Cambria Math" w:hAnsi="Cambria Math" w:cs="Cambria Math"/>
+          <w:sz w:val="26"/>
+          <w:szCs w:val="26"/>
+        </w:rPr>
+        <w:t>⇅</w:t>
+      </w:r>
+      <w:r>
+        <w:rPr>
+          <w:sz w:val="26"/>
+          <w:szCs w:val="26"/>
+        </w:rPr>
+        <w:t>” for easy swapping between two selected currencies to see their exchange without reselecting.</w:t>
       </w:r>
     </w:p>
     <w:p>
@@ -3503,14 +3748,14 @@
           <w:sz w:val="26"/>
           <w:szCs w:val="26"/>
         </w:rPr>
-        <w:t>Convert Button</w:t>
-      </w:r>
-      <w:r>
-        <w:rPr>
-          <w:sz w:val="26"/>
-          <w:szCs w:val="26"/>
-        </w:rPr>
-        <w:t>: We placed an action button labeled "Convert" that triggers the conversion calculation when clicked. Upon clicking, the application retrieves the exchange rates for both selected currencies and performs the conversion instantly.</w:t>
+        <w:t>Amount Input Field</w:t>
+      </w:r>
+      <w:r>
+        <w:rPr>
+          <w:sz w:val="26"/>
+          <w:szCs w:val="26"/>
+        </w:rPr>
+        <w:t>: We created a text input field labeled "Amount" with a default value of 1. This field accepts numeric input that users can modify to specify the quantity of currency they wish to convert. The field is positioned centrally for easy access.</w:t>
       </w:r>
     </w:p>
     <w:p>
@@ -3528,14 +3773,14 @@
           <w:sz w:val="26"/>
           <w:szCs w:val="26"/>
         </w:rPr>
-        <w:t>Result Display Label</w:t>
-      </w:r>
-      <w:r>
-        <w:rPr>
-          <w:sz w:val="26"/>
-          <w:szCs w:val="26"/>
-        </w:rPr>
-        <w:t>: Below the Convert button, we added a result label that displays the conversion output in a clear format: "Result: [Amount] [Source Code] = [Converted Amount] [Target Code]". For example, "Result: 100.00 USD = 150,000.00 NGN". The label initially displays "Result: —" as a placeholder until a conversion is performed.</w:t>
+        <w:t>Convert Button</w:t>
+      </w:r>
+      <w:r>
+        <w:rPr>
+          <w:sz w:val="26"/>
+          <w:szCs w:val="26"/>
+        </w:rPr>
+        <w:t>: We placed an action button labeled "Convert" that triggers the conversion calculation when clicked. Upon clicking, the application retrieves the exchange rates for both selected currencies and performs the conversion instantly.</w:t>
       </w:r>
     </w:p>
     <w:p>
@@ -3553,14 +3798,14 @@
           <w:sz w:val="26"/>
           <w:szCs w:val="26"/>
         </w:rPr>
-        <w:t>API Information Section</w:t>
-      </w:r>
-      <w:r>
-        <w:rPr>
-          <w:sz w:val="26"/>
-          <w:szCs w:val="26"/>
-        </w:rPr>
-        <w:t>: At the bottom of the application, we included a text area displaying information about the data source: "Live exchange rates provided by open.er-api.com" and "Default base currency: USD". This informs users where the exchange rates originate and ensures transparency about the conversion methodology.</w:t>
+        <w:t>Result Display Label</w:t>
+      </w:r>
+      <w:r>
+        <w:rPr>
+          <w:sz w:val="26"/>
+          <w:szCs w:val="26"/>
+        </w:rPr>
+        <w:t>: Below the Convert button, we added a result label that displays the conversion output in a clear format: "Result: [Amount] [Source Code] = [Converted Amount] [Target Code]". For example, "Result: 100.00 USD = 150,000.00 NGN". The label initially displays "Result: —" as a placeholder until a conversion is performed.</w:t>
       </w:r>
     </w:p>
     <w:p>
@@ -3579,30 +3824,14 @@
           <w:szCs w:val="26"/>
         </w:rPr>
         <w:lastRenderedPageBreak/>
-        <w:t>Background Thread for Rate Fetching</w:t>
-      </w:r>
-      <w:r>
-        <w:rPr>
-          <w:sz w:val="26"/>
-          <w:szCs w:val="26"/>
-        </w:rPr>
-        <w:t xml:space="preserve">: We implemented a background thread that automatically fetches exchange rates from the </w:t>
-      </w:r>
-      <w:proofErr w:type="spellStart"/>
-      <w:r>
-        <w:rPr>
-          <w:sz w:val="26"/>
-          <w:szCs w:val="26"/>
-        </w:rPr>
-        <w:t>ExchangeRate</w:t>
-      </w:r>
-      <w:proofErr w:type="spellEnd"/>
-      <w:r>
-        <w:rPr>
-          <w:sz w:val="26"/>
-          <w:szCs w:val="26"/>
-        </w:rPr>
-        <w:t>-API when the application starts. This ensures the application remains responsive while waiting for the API response, and users can see the interface populate with currencies without any freezing or lag.</w:t>
+        <w:t>API Information Section</w:t>
+      </w:r>
+      <w:r>
+        <w:rPr>
+          <w:sz w:val="26"/>
+          <w:szCs w:val="26"/>
+        </w:rPr>
+        <w:t>: At the bottom of the application, we included a text area displaying information about the data source: "Live exchange rates provided by open.er-api.com" and "Default base currency: USD". This informs users where the exchange rates originate and ensures transparency about the conversion methodology.</w:t>
       </w:r>
     </w:p>
     <w:p>
@@ -3620,14 +3849,14 @@
           <w:sz w:val="26"/>
           <w:szCs w:val="26"/>
         </w:rPr>
-        <w:t>Currency Renderer with Flag Icons</w:t>
-      </w:r>
-      <w:r>
-        <w:rPr>
-          <w:sz w:val="26"/>
-          <w:szCs w:val="26"/>
-        </w:rPr>
-        <w:t>: We created a custom renderer (</w:t>
+        <w:t>Background Thread for Rate Fetching</w:t>
+      </w:r>
+      <w:r>
+        <w:rPr>
+          <w:sz w:val="26"/>
+          <w:szCs w:val="26"/>
+        </w:rPr>
+        <w:t xml:space="preserve">: We implemented a background thread that automatically fetches exchange rates from the </w:t>
       </w:r>
       <w:proofErr w:type="spellStart"/>
       <w:r>
@@ -3635,7 +3864,7 @@
           <w:sz w:val="26"/>
           <w:szCs w:val="26"/>
         </w:rPr>
-        <w:t>CurrencyRenderer</w:t>
+        <w:t>ExchangeRate</w:t>
       </w:r>
       <w:proofErr w:type="spellEnd"/>
       <w:r>
@@ -3643,7 +3872,7 @@
           <w:sz w:val="26"/>
           <w:szCs w:val="26"/>
         </w:rPr>
-        <w:t>) that displays both currency codes and flag icons in the dropdown boxes. The flags are scaled to 20x14 pixels and positioned to the left of the currency name, providing visual enhancement and making currency identification faster and more intuitive.</w:t>
+        <w:t>-API when the application starts. This ensures the application remains responsive while waiting for the API response, and users can see the interface populate with currencies without any freezing or lag.</w:t>
       </w:r>
     </w:p>
     <w:p>
@@ -3661,6 +3890,47 @@
           <w:sz w:val="26"/>
           <w:szCs w:val="26"/>
         </w:rPr>
+        <w:t>Currency Renderer with Flag Icons</w:t>
+      </w:r>
+      <w:r>
+        <w:rPr>
+          <w:sz w:val="26"/>
+          <w:szCs w:val="26"/>
+        </w:rPr>
+        <w:t>: We created a custom renderer (</w:t>
+      </w:r>
+      <w:proofErr w:type="spellStart"/>
+      <w:r>
+        <w:rPr>
+          <w:sz w:val="26"/>
+          <w:szCs w:val="26"/>
+        </w:rPr>
+        <w:t>CurrencyRenderer</w:t>
+      </w:r>
+      <w:proofErr w:type="spellEnd"/>
+      <w:r>
+        <w:rPr>
+          <w:sz w:val="26"/>
+          <w:szCs w:val="26"/>
+        </w:rPr>
+        <w:t>) that displays both currency codes and flag icons in the dropdown boxes. The flags are scaled to 20x14 pixels and positioned to the left of the currency name, providing visual enhancement and making currency identification faster and more intuitive.</w:t>
+      </w:r>
+    </w:p>
+    <w:p>
+      <w:pPr>
+        <w:pStyle w:val="font-claude-response-body"/>
+        <w:spacing w:line="276" w:lineRule="auto"/>
+        <w:rPr>
+          <w:sz w:val="26"/>
+          <w:szCs w:val="26"/>
+        </w:rPr>
+      </w:pPr>
+      <w:r>
+        <w:rPr>
+          <w:rStyle w:val="Strong"/>
+          <w:sz w:val="26"/>
+          <w:szCs w:val="26"/>
+        </w:rPr>
         <w:t>Error Handling</w:t>
       </w:r>
       <w:r>
@@ -3670,6 +3940,16 @@
         </w:rPr>
         <w:t>: We implemented error handling for invalid numeric inputs and API failures. If users enter non-numeric values, the application displays an error dialog. If the API fails to fetch exchange rates, an error message informs users and provides details about the failure.</w:t>
       </w:r>
+    </w:p>
+    <w:p>
+      <w:pPr>
+        <w:pStyle w:val="font-claude-response-body"/>
+        <w:spacing w:line="276" w:lineRule="auto"/>
+        <w:rPr>
+          <w:sz w:val="26"/>
+          <w:szCs w:val="26"/>
+        </w:rPr>
+      </w:pPr>
     </w:p>
     <w:p>
       <w:pPr>
@@ -3800,6 +4080,29 @@
           <w:sz w:val="26"/>
           <w:szCs w:val="26"/>
         </w:rPr>
+        <w:br w:type="page"/>
+      </w:r>
+    </w:p>
+    <w:p>
+      <w:pPr>
+        <w:pStyle w:val="font-claude-response-body"/>
+        <w:spacing w:line="276" w:lineRule="auto"/>
+        <w:jc w:val="both"/>
+        <w:rPr>
+          <w:b/>
+          <w:bCs/>
+          <w:sz w:val="26"/>
+          <w:szCs w:val="26"/>
+        </w:rPr>
+      </w:pPr>
+      <w:r>
+        <w:rPr>
+          <w:b/>
+          <w:bCs/>
+          <w:sz w:val="26"/>
+          <w:szCs w:val="26"/>
+        </w:rPr>
+        <w:lastRenderedPageBreak/>
         <w:t>PREVIEW:</w:t>
       </w:r>
     </w:p>
@@ -3824,10 +4127,10 @@
           <w:szCs w:val="26"/>
         </w:rPr>
         <w:drawing>
-          <wp:inline distT="0" distB="0" distL="0" distR="0" wp14:anchorId="5C88D34C" wp14:editId="1970BADA">
-            <wp:extent cx="4742822" cy="2186751"/>
-            <wp:effectExtent l="0" t="0" r="635" b="4445"/>
-            <wp:docPr id="1" name="Picture 1"/>
+          <wp:inline distT="0" distB="0" distL="0" distR="0" wp14:anchorId="377FA345" wp14:editId="5D28BC1E">
+            <wp:extent cx="4454591" cy="4448175"/>
+            <wp:effectExtent l="0" t="0" r="3175" b="0"/>
+            <wp:docPr id="2" name="Picture 2"/>
             <wp:cNvGraphicFramePr>
               <a:graphicFrameLocks xmlns:a="http://schemas.openxmlformats.org/drawingml/2006/main" noChangeAspect="1"/>
             </wp:cNvGraphicFramePr>
@@ -3847,7 +4150,7 @@
                   <pic:spPr>
                     <a:xfrm>
                       <a:off x="0" y="0"/>
-                      <a:ext cx="4770741" cy="2199624"/>
+                      <a:ext cx="4456384" cy="4449965"/>
                     </a:xfrm>
                     <a:prstGeom prst="rect">
                       <a:avLst/>
@@ -3871,7 +4174,10 @@
           <w:szCs w:val="32"/>
         </w:rPr>
       </w:pPr>
-      <w:r>
+    </w:p>
+    <w:p>
+      <w:pPr>
+        <w:spacing w:before="100" w:beforeAutospacing="1" w:after="100" w:afterAutospacing="1" w:line="240" w:lineRule="auto"/>
         <w:rPr>
           <w:rFonts w:ascii="Times New Roman" w:eastAsia="Times New Roman" w:hAnsi="Times New Roman" w:cs="Times New Roman"/>
           <w:b/>
@@ -3879,8 +4185,7 @@
           <w:sz w:val="32"/>
           <w:szCs w:val="32"/>
         </w:rPr>
-        <w:br w:type="page"/>
-      </w:r>
+      </w:pPr>
       <w:r>
         <w:rPr>
           <w:rFonts w:ascii="Times New Roman" w:eastAsia="Times New Roman" w:hAnsi="Times New Roman" w:cs="Times New Roman"/>
@@ -3889,7 +4194,6 @@
           <w:sz w:val="32"/>
           <w:szCs w:val="32"/>
         </w:rPr>
-        <w:lastRenderedPageBreak/>
         <w:t>CODE SNIPPET</w:t>
       </w:r>
       <w:r>
@@ -3906,6 +4210,7 @@
     <w:p>
       <w:pPr>
         <w:spacing w:before="100" w:beforeAutospacing="1" w:after="100" w:afterAutospacing="1" w:line="240" w:lineRule="auto"/>
+        <w:jc w:val="center"/>
         <w:rPr>
           <w:rFonts w:ascii="Times New Roman" w:eastAsia="Times New Roman" w:hAnsi="Times New Roman" w:cs="Times New Roman"/>
           <w:sz w:val="24"/>
@@ -3915,15 +4220,14 @@
       <w:r>
         <w:rPr>
           <w:rFonts w:ascii="Times New Roman" w:eastAsia="Times New Roman" w:hAnsi="Times New Roman" w:cs="Times New Roman"/>
-          <w:noProof/>
           <w:sz w:val="24"/>
           <w:szCs w:val="24"/>
         </w:rPr>
         <w:drawing>
-          <wp:inline distT="0" distB="0" distL="0" distR="0" wp14:anchorId="3A13E0D1" wp14:editId="1F75F88D">
-            <wp:extent cx="5731510" cy="4181475"/>
-            <wp:effectExtent l="0" t="0" r="2540" b="9525"/>
-            <wp:docPr id="13" name="Picture 13"/>
+          <wp:inline distT="0" distB="0" distL="0" distR="0" wp14:anchorId="37F712DF" wp14:editId="61DA454B">
+            <wp:extent cx="5438775" cy="3400425"/>
+            <wp:effectExtent l="0" t="0" r="9525" b="9525"/>
+            <wp:docPr id="1" name="Picture 1"/>
             <wp:cNvGraphicFramePr>
               <a:graphicFrameLocks xmlns:a="http://schemas.openxmlformats.org/drawingml/2006/main" noChangeAspect="1"/>
             </wp:cNvGraphicFramePr>
@@ -3943,7 +4247,7 @@
                   <pic:spPr>
                     <a:xfrm>
                       <a:off x="0" y="0"/>
-                      <a:ext cx="5731510" cy="4181475"/>
+                      <a:ext cx="5444991" cy="3404311"/>
                     </a:xfrm>
                     <a:prstGeom prst="rect">
                       <a:avLst/>
@@ -3961,6 +4265,40 @@
         <w:spacing w:before="100" w:beforeAutospacing="1" w:after="100" w:afterAutospacing="1" w:line="240" w:lineRule="auto"/>
         <w:rPr>
           <w:rFonts w:ascii="Times New Roman" w:eastAsia="Times New Roman" w:hAnsi="Times New Roman" w:cs="Times New Roman"/>
+          <w:b/>
+          <w:bCs/>
+          <w:sz w:val="32"/>
+          <w:szCs w:val="32"/>
+        </w:rPr>
+      </w:pPr>
+      <w:r>
+        <w:rPr>
+          <w:rFonts w:ascii="Times New Roman" w:eastAsia="Times New Roman" w:hAnsi="Times New Roman" w:cs="Times New Roman"/>
+          <w:b/>
+          <w:bCs/>
+          <w:sz w:val="32"/>
+          <w:szCs w:val="32"/>
+        </w:rPr>
+        <w:lastRenderedPageBreak/>
+        <w:t>CODE SNIPPET</w:t>
+      </w:r>
+      <w:r>
+        <w:rPr>
+          <w:rFonts w:ascii="Times New Roman" w:eastAsia="Times New Roman" w:hAnsi="Times New Roman" w:cs="Times New Roman"/>
+          <w:b/>
+          <w:bCs/>
+          <w:sz w:val="32"/>
+          <w:szCs w:val="32"/>
+        </w:rPr>
+        <w:t>S</w:t>
+      </w:r>
+    </w:p>
+    <w:p>
+      <w:pPr>
+        <w:spacing w:before="100" w:beforeAutospacing="1" w:after="100" w:afterAutospacing="1" w:line="240" w:lineRule="auto"/>
+        <w:jc w:val="center"/>
+        <w:rPr>
+          <w:rFonts w:ascii="Times New Roman" w:eastAsia="Times New Roman" w:hAnsi="Times New Roman" w:cs="Times New Roman"/>
           <w:sz w:val="24"/>
           <w:szCs w:val="24"/>
         </w:rPr>
@@ -3968,15 +4306,14 @@
       <w:r>
         <w:rPr>
           <w:rFonts w:ascii="Times New Roman" w:eastAsia="Times New Roman" w:hAnsi="Times New Roman" w:cs="Times New Roman"/>
-          <w:noProof/>
           <w:sz w:val="24"/>
           <w:szCs w:val="24"/>
         </w:rPr>
         <w:drawing>
-          <wp:inline distT="0" distB="0" distL="0" distR="0" wp14:anchorId="22A22DC6" wp14:editId="76E402FE">
-            <wp:extent cx="5731510" cy="4181475"/>
-            <wp:effectExtent l="0" t="0" r="2540" b="9525"/>
-            <wp:docPr id="14" name="Picture 14"/>
+          <wp:inline distT="0" distB="0" distL="0" distR="0" wp14:anchorId="713D0DC4" wp14:editId="5AA2132C">
+            <wp:extent cx="6067186" cy="3695700"/>
+            <wp:effectExtent l="0" t="0" r="0" b="0"/>
+            <wp:docPr id="3" name="Picture 3"/>
             <wp:cNvGraphicFramePr>
               <a:graphicFrameLocks xmlns:a="http://schemas.openxmlformats.org/drawingml/2006/main" noChangeAspect="1"/>
             </wp:cNvGraphicFramePr>
@@ -3988,7 +4325,7 @@
                     <pic:cNvPicPr/>
                   </pic:nvPicPr>
                   <pic:blipFill>
-                    <a:blip r:embed="rId12"/>
+                    <a:blip r:embed="rId13"/>
                     <a:stretch>
                       <a:fillRect/>
                     </a:stretch>
@@ -3996,7 +4333,7 @@
                   <pic:spPr>
                     <a:xfrm>
                       <a:off x="0" y="0"/>
-                      <a:ext cx="5731510" cy="4181475"/>
+                      <a:ext cx="6079586" cy="3703253"/>
                     </a:xfrm>
                     <a:prstGeom prst="rect">
                       <a:avLst/>
@@ -4012,6 +4349,7 @@
     <w:p>
       <w:pPr>
         <w:spacing w:before="100" w:beforeAutospacing="1" w:after="100" w:afterAutospacing="1" w:line="240" w:lineRule="auto"/>
+        <w:jc w:val="center"/>
         <w:rPr>
           <w:rFonts w:ascii="Times New Roman" w:eastAsia="Times New Roman" w:hAnsi="Times New Roman" w:cs="Times New Roman"/>
           <w:sz w:val="24"/>
@@ -4019,6 +4357,51 @@
         </w:rPr>
       </w:pPr>
       <w:r>
+        <w:rPr>
+          <w:rFonts w:ascii="Times New Roman" w:eastAsia="Times New Roman" w:hAnsi="Times New Roman" w:cs="Times New Roman"/>
+          <w:sz w:val="24"/>
+          <w:szCs w:val="24"/>
+        </w:rPr>
+        <w:drawing>
+          <wp:inline distT="0" distB="0" distL="0" distR="0" wp14:anchorId="5BA71A1B" wp14:editId="198D3ECC">
+            <wp:extent cx="6128682" cy="3752850"/>
+            <wp:effectExtent l="0" t="0" r="5715" b="0"/>
+            <wp:docPr id="4" name="Picture 4"/>
+            <wp:cNvGraphicFramePr>
+              <a:graphicFrameLocks xmlns:a="http://schemas.openxmlformats.org/drawingml/2006/main" noChangeAspect="1"/>
+            </wp:cNvGraphicFramePr>
+            <a:graphic xmlns:a="http://schemas.openxmlformats.org/drawingml/2006/main">
+              <a:graphicData uri="http://schemas.openxmlformats.org/drawingml/2006/picture">
+                <pic:pic xmlns:pic="http://schemas.openxmlformats.org/drawingml/2006/picture">
+                  <pic:nvPicPr>
+                    <pic:cNvPr id="1" name=""/>
+                    <pic:cNvPicPr/>
+                  </pic:nvPicPr>
+                  <pic:blipFill>
+                    <a:blip r:embed="rId14"/>
+                    <a:stretch>
+                      <a:fillRect/>
+                    </a:stretch>
+                  </pic:blipFill>
+                  <pic:spPr>
+                    <a:xfrm>
+                      <a:off x="0" y="0"/>
+                      <a:ext cx="6134480" cy="3756401"/>
+                    </a:xfrm>
+                    <a:prstGeom prst="rect">
+                      <a:avLst/>
+                    </a:prstGeom>
+                  </pic:spPr>
+                </pic:pic>
+              </a:graphicData>
+            </a:graphic>
+          </wp:inline>
+        </w:drawing>
+      </w:r>
+    </w:p>
+    <w:p>
+      <w:pPr>
+        <w:spacing w:before="100" w:beforeAutospacing="1" w:after="100" w:afterAutospacing="1" w:line="240" w:lineRule="auto"/>
         <w:rPr>
           <w:rFonts w:ascii="Times New Roman" w:eastAsia="Times New Roman" w:hAnsi="Times New Roman" w:cs="Times New Roman"/>
           <w:b/>
@@ -4026,6 +4409,35 @@
           <w:sz w:val="32"/>
           <w:szCs w:val="32"/>
         </w:rPr>
+      </w:pPr>
+      <w:r>
+        <w:rPr>
+          <w:rFonts w:ascii="Times New Roman" w:eastAsia="Times New Roman" w:hAnsi="Times New Roman" w:cs="Times New Roman"/>
+          <w:b/>
+          <w:bCs/>
+          <w:sz w:val="32"/>
+          <w:szCs w:val="32"/>
+        </w:rPr>
+        <w:br w:type="page"/>
+      </w:r>
+    </w:p>
+    <w:p>
+      <w:pPr>
+        <w:spacing w:before="100" w:beforeAutospacing="1" w:after="100" w:afterAutospacing="1" w:line="240" w:lineRule="auto"/>
+        <w:rPr>
+          <w:rFonts w:ascii="Times New Roman" w:eastAsia="Times New Roman" w:hAnsi="Times New Roman" w:cs="Times New Roman"/>
+          <w:sz w:val="24"/>
+          <w:szCs w:val="24"/>
+        </w:rPr>
+      </w:pPr>
+      <w:r>
+        <w:rPr>
+          <w:rFonts w:ascii="Times New Roman" w:eastAsia="Times New Roman" w:hAnsi="Times New Roman" w:cs="Times New Roman"/>
+          <w:b/>
+          <w:bCs/>
+          <w:sz w:val="32"/>
+          <w:szCs w:val="32"/>
+        </w:rPr>
         <w:lastRenderedPageBreak/>
         <w:t>USER GUIDE</w:t>
       </w:r>
@@ -4279,6 +4691,30 @@
       </w:r>
       <w:r>
         <w:t xml:space="preserve"> Close the application when finished converting currencies</w:t>
+      </w:r>
+    </w:p>
+    <w:p>
+      <w:pPr>
+        <w:pStyle w:val="font-claude-response-body"/>
+      </w:pPr>
+      <w:r>
+        <w:rPr>
+          <w:b/>
+          <w:bCs/>
+        </w:rPr>
+        <w:t xml:space="preserve">Tip: </w:t>
+      </w:r>
+      <w:r>
+        <w:t>You can use the swap button represented by “</w:t>
+      </w:r>
+      <w:r>
+        <w:rPr>
+          <w:rFonts w:ascii="Cambria Math" w:hAnsi="Cambria Math" w:cs="Cambria Math"/>
+        </w:rPr>
+        <w:t>⇅</w:t>
+      </w:r>
+      <w:r>
+        <w:t xml:space="preserve">” to easily swap between the selected currencies to see their rate immediately. </w:t>
       </w:r>
     </w:p>
     <w:p>
@@ -4442,7 +4878,7 @@
         </w:rPr>
         <w:t xml:space="preserve">-API Documentation - </w:t>
       </w:r>
-      <w:hyperlink r:id="rId13" w:history="1">
+      <w:hyperlink r:id="rId15" w:history="1">
         <w:r>
           <w:rPr>
             <w:rStyle w:val="Hyperlink"/>
@@ -4507,7 +4943,7 @@
         </w:rPr>
         <w:t xml:space="preserve">-API - </w:t>
       </w:r>
-      <w:hyperlink r:id="rId14" w:history="1">
+      <w:hyperlink r:id="rId16" w:history="1">
         <w:r>
           <w:rPr>
             <w:rStyle w:val="Hyperlink"/>
@@ -4571,7 +5007,7 @@
         </w:rPr>
         <w:t xml:space="preserve"> Documentation - </w:t>
       </w:r>
-      <w:hyperlink r:id="rId15" w:history="1">
+      <w:hyperlink r:id="rId17" w:history="1">
         <w:r>
           <w:rPr>
             <w:rStyle w:val="Hyperlink"/>
@@ -4617,7 +5053,7 @@
         </w:rPr>
         <w:t xml:space="preserve">Java Swing Documentation - </w:t>
       </w:r>
-      <w:hyperlink r:id="rId16" w:history="1">
+      <w:hyperlink r:id="rId18" w:history="1">
         <w:r>
           <w:rPr>
             <w:rStyle w:val="Hyperlink"/>
@@ -4661,7 +5097,7 @@
         </w:rPr>
         <w:t xml:space="preserve">JSON Processing in Java - </w:t>
       </w:r>
-      <w:hyperlink r:id="rId17" w:history="1">
+      <w:hyperlink r:id="rId19" w:history="1">
         <w:r>
           <w:rPr>
             <w:rStyle w:val="Hyperlink"/>
@@ -4703,7 +5139,7 @@
         </w:rPr>
         <w:t xml:space="preserve">Wikipedia - Exchange Rate - </w:t>
       </w:r>
-      <w:hyperlink r:id="rId18" w:history="1">
+      <w:hyperlink r:id="rId20" w:history="1">
         <w:r>
           <w:rPr>
             <w:rStyle w:val="Hyperlink"/>
@@ -4743,7 +5179,7 @@
         </w:rPr>
         <w:t xml:space="preserve">Maven Project Management - </w:t>
       </w:r>
-      <w:hyperlink r:id="rId19" w:history="1">
+      <w:hyperlink r:id="rId21" w:history="1">
         <w:r>
           <w:rPr>
             <w:rStyle w:val="Hyperlink"/>
@@ -8410,6 +8846,28 @@
   <w:style w:type="paragraph" w:default="1" w:styleId="Normal">
     <w:name w:val="Normal"/>
     <w:qFormat/>
+    <w:rsid w:val="00166607"/>
+  </w:style>
+  <w:style w:type="paragraph" w:styleId="Heading1">
+    <w:name w:val="heading 1"/>
+    <w:basedOn w:val="Normal"/>
+    <w:next w:val="Normal"/>
+    <w:link w:val="Heading1Char"/>
+    <w:uiPriority w:val="9"/>
+    <w:qFormat/>
+    <w:rsid w:val="00166607"/>
+    <w:pPr>
+      <w:keepNext/>
+      <w:keepLines/>
+      <w:spacing w:before="240" w:after="0"/>
+      <w:outlineLvl w:val="0"/>
+    </w:pPr>
+    <w:rPr>
+      <w:rFonts w:asciiTheme="majorHAnsi" w:eastAsiaTheme="majorEastAsia" w:hAnsiTheme="majorHAnsi" w:cstheme="majorBidi"/>
+      <w:color w:val="2F5496" w:themeColor="accent1" w:themeShade="BF"/>
+      <w:sz w:val="32"/>
+      <w:szCs w:val="32"/>
+    </w:rPr>
   </w:style>
   <w:style w:type="paragraph" w:styleId="Heading2">
     <w:name w:val="heading 2"/>
@@ -8669,6 +9127,19 @@
       <w:bCs/>
       <w:sz w:val="36"/>
       <w:szCs w:val="36"/>
+    </w:rPr>
+  </w:style>
+  <w:style w:type="character" w:customStyle="1" w:styleId="Heading1Char">
+    <w:name w:val="Heading 1 Char"/>
+    <w:basedOn w:val="DefaultParagraphFont"/>
+    <w:link w:val="Heading1"/>
+    <w:uiPriority w:val="9"/>
+    <w:rsid w:val="00166607"/>
+    <w:rPr>
+      <w:rFonts w:asciiTheme="majorHAnsi" w:eastAsiaTheme="majorEastAsia" w:hAnsiTheme="majorHAnsi" w:cstheme="majorBidi"/>
+      <w:color w:val="2F5496" w:themeColor="accent1" w:themeShade="BF"/>
+      <w:sz w:val="32"/>
+      <w:szCs w:val="32"/>
     </w:rPr>
   </w:style>
 </w:styles>

</xml_diff>

<commit_message>
Fix: correct leturer name in project report - Correct the name from ODUFUNWA to ODUFUWA
</commit_message>
<xml_diff>
--- a/Currency converter project report.docx
+++ b/Currency converter project report.docx
@@ -299,7 +299,7 @@
           <w:sz w:val="36"/>
           <w:szCs w:val="36"/>
         </w:rPr>
-        <w:t>ODUFUNWA</w:t>
+        <w:t>ODUFUWA</w:t>
       </w:r>
       <w:proofErr w:type="spellEnd"/>
       <w:r>
@@ -1941,25 +1941,7 @@
           <w:sz w:val="26"/>
           <w:szCs w:val="26"/>
         </w:rPr>
-        <w:t xml:space="preserve">Integrating with </w:t>
-      </w:r>
-      <w:proofErr w:type="spellStart"/>
-      <w:r>
-        <w:rPr>
-          <w:rFonts w:ascii="Times New Roman" w:eastAsia="Times New Roman" w:hAnsi="Times New Roman" w:cs="Times New Roman"/>
-          <w:sz w:val="26"/>
-          <w:szCs w:val="26"/>
-        </w:rPr>
-        <w:t>ExchangeRate</w:t>
-      </w:r>
-      <w:proofErr w:type="spellEnd"/>
-      <w:r>
-        <w:rPr>
-          <w:rFonts w:ascii="Times New Roman" w:eastAsia="Times New Roman" w:hAnsi="Times New Roman" w:cs="Times New Roman"/>
-          <w:sz w:val="26"/>
-          <w:szCs w:val="26"/>
-        </w:rPr>
-        <w:t xml:space="preserve">-API for live exchange rate data </w:t>
+        <w:t xml:space="preserve">Integrating with ExchangeRate-API for live exchange rate data </w:t>
       </w:r>
     </w:p>
     <w:p>
@@ -2301,25 +2283,7 @@
           <w:sz w:val="26"/>
           <w:szCs w:val="26"/>
         </w:rPr>
-        <w:t xml:space="preserve">: Automatically fetches live exchange rates from </w:t>
-      </w:r>
-      <w:proofErr w:type="spellStart"/>
-      <w:r>
-        <w:rPr>
-          <w:rFonts w:ascii="Times New Roman" w:eastAsia="Times New Roman" w:hAnsi="Times New Roman" w:cs="Times New Roman"/>
-          <w:sz w:val="26"/>
-          <w:szCs w:val="26"/>
-        </w:rPr>
-        <w:t>ExchangeRate</w:t>
-      </w:r>
-      <w:proofErr w:type="spellEnd"/>
-      <w:r>
-        <w:rPr>
-          <w:rFonts w:ascii="Times New Roman" w:eastAsia="Times New Roman" w:hAnsi="Times New Roman" w:cs="Times New Roman"/>
-          <w:sz w:val="26"/>
-          <w:szCs w:val="26"/>
-        </w:rPr>
-        <w:t>-API on application startup</w:t>
+        <w:t>: Automatically fetches live exchange rates from ExchangeRate-API on application startup</w:t>
       </w:r>
     </w:p>
     <w:p>
@@ -3138,25 +3102,7 @@
           <w:sz w:val="26"/>
           <w:szCs w:val="26"/>
         </w:rPr>
-        <w:t xml:space="preserve">Step 3: Launch background thread to fetch exchange rates from </w:t>
-      </w:r>
-      <w:proofErr w:type="spellStart"/>
-      <w:r>
-        <w:rPr>
-          <w:rFonts w:ascii="Times New Roman" w:eastAsia="Times New Roman" w:hAnsi="Times New Roman" w:cs="Times New Roman"/>
-          <w:sz w:val="26"/>
-          <w:szCs w:val="26"/>
-        </w:rPr>
-        <w:t>ExchangeRate</w:t>
-      </w:r>
-      <w:proofErr w:type="spellEnd"/>
-      <w:r>
-        <w:rPr>
-          <w:rFonts w:ascii="Times New Roman" w:eastAsia="Times New Roman" w:hAnsi="Times New Roman" w:cs="Times New Roman"/>
-          <w:sz w:val="26"/>
-          <w:szCs w:val="26"/>
-        </w:rPr>
-        <w:t>-API (open.er-api.com)</w:t>
+        <w:t>Step 3: Launch background thread to fetch exchange rates from ExchangeRate-API (open.er-api.com)</w:t>
       </w:r>
     </w:p>
     <w:p>
@@ -3582,23 +3528,7 @@
           <w:sz w:val="26"/>
           <w:szCs w:val="26"/>
         </w:rPr>
-        <w:t xml:space="preserve">In developing the Live Currency Converter Application, we started by designing and building the interface using Java Swing with Visual Studio Code as our code editor. Before starting the design, we installed Java 21 and configured Maven for dependency management. We then used the </w:t>
-      </w:r>
-      <w:proofErr w:type="spellStart"/>
-      <w:r>
-        <w:rPr>
-          <w:sz w:val="26"/>
-          <w:szCs w:val="26"/>
-        </w:rPr>
-        <w:t>ExchangeRate</w:t>
-      </w:r>
-      <w:proofErr w:type="spellEnd"/>
-      <w:r>
-        <w:rPr>
-          <w:sz w:val="26"/>
-          <w:szCs w:val="26"/>
-        </w:rPr>
-        <w:t>-API integration with Java's built-in HTTP client to enable the core functionalities including real-time exchange rate fetching and currency conversion algorithms.</w:t>
+        <w:t>In developing the Live Currency Converter Application, we started by designing and building the interface using Java Swing with Visual Studio Code as our code editor. Before starting the design, we installed Java 21 and configured Maven for dependency management. We then used the ExchangeRate-API integration with Java's built-in HTTP client to enable the core functionalities including real-time exchange rate fetching and currency conversion algorithms.</w:t>
       </w:r>
     </w:p>
     <w:p>
@@ -3856,23 +3786,7 @@
           <w:sz w:val="26"/>
           <w:szCs w:val="26"/>
         </w:rPr>
-        <w:t xml:space="preserve">: We implemented a background thread that automatically fetches exchange rates from the </w:t>
-      </w:r>
-      <w:proofErr w:type="spellStart"/>
-      <w:r>
-        <w:rPr>
-          <w:sz w:val="26"/>
-          <w:szCs w:val="26"/>
-        </w:rPr>
-        <w:t>ExchangeRate</w:t>
-      </w:r>
-      <w:proofErr w:type="spellEnd"/>
-      <w:r>
-        <w:rPr>
-          <w:sz w:val="26"/>
-          <w:szCs w:val="26"/>
-        </w:rPr>
-        <w:t>-API when the application starts. This ensures the application remains responsive while waiting for the API response, and users can see the interface populate with currencies without any freezing or lag.</w:t>
+        <w:t>: We implemented a background thread that automatically fetches exchange rates from the ExchangeRate-API when the application starts. This ensures the application remains responsive while waiting for the API response, and users can see the interface populate with currencies without any freezing or lag.</w:t>
       </w:r>
     </w:p>
     <w:p>
@@ -3897,23 +3811,7 @@
           <w:sz w:val="26"/>
           <w:szCs w:val="26"/>
         </w:rPr>
-        <w:t>: We created a custom renderer (</w:t>
-      </w:r>
-      <w:proofErr w:type="spellStart"/>
-      <w:r>
-        <w:rPr>
-          <w:sz w:val="26"/>
-          <w:szCs w:val="26"/>
-        </w:rPr>
-        <w:t>CurrencyRenderer</w:t>
-      </w:r>
-      <w:proofErr w:type="spellEnd"/>
-      <w:r>
-        <w:rPr>
-          <w:sz w:val="26"/>
-          <w:szCs w:val="26"/>
-        </w:rPr>
-        <w:t>) that displays both currency codes and flag icons in the dropdown boxes. The flags are scaled to 20x14 pixels and positioned to the left of the currency name, providing visual enhancement and making currency identification faster and more intuitive.</w:t>
+        <w:t>: We created a custom renderer (CurrencyRenderer) that displays both currency codes and flag icons in the dropdown boxes. The flags are scaled to 20x14 pixels and positioned to the left of the currency name, providing visual enhancement and making currency identification faster and more intuitive.</w:t>
       </w:r>
     </w:p>
     <w:p>
@@ -4042,23 +3940,7 @@
           <w:sz w:val="26"/>
           <w:szCs w:val="26"/>
         </w:rPr>
-        <w:t xml:space="preserve">: A custom list cell renderer that extends </w:t>
-      </w:r>
-      <w:proofErr w:type="spellStart"/>
-      <w:r>
-        <w:rPr>
-          <w:sz w:val="26"/>
-          <w:szCs w:val="26"/>
-        </w:rPr>
-        <w:t>DefaultListCellRenderer</w:t>
-      </w:r>
-      <w:proofErr w:type="spellEnd"/>
-      <w:r>
-        <w:rPr>
-          <w:sz w:val="26"/>
-          <w:szCs w:val="26"/>
-        </w:rPr>
-        <w:t xml:space="preserve"> to display currency items with flag icons alongside currency names in the dropdown boxes.</w:t>
+        <w:t>: A custom list cell renderer that extends DefaultListCellRenderer to display currency items with flag icons alongside currency names in the dropdown boxes.</w:t>
       </w:r>
     </w:p>
     <w:p>
@@ -4220,6 +4102,7 @@
       <w:r>
         <w:rPr>
           <w:rFonts w:ascii="Times New Roman" w:eastAsia="Times New Roman" w:hAnsi="Times New Roman" w:cs="Times New Roman"/>
+          <w:noProof/>
           <w:sz w:val="24"/>
           <w:szCs w:val="24"/>
         </w:rPr>
@@ -4306,6 +4189,7 @@
       <w:r>
         <w:rPr>
           <w:rFonts w:ascii="Times New Roman" w:eastAsia="Times New Roman" w:hAnsi="Times New Roman" w:cs="Times New Roman"/>
+          <w:noProof/>
           <w:sz w:val="24"/>
           <w:szCs w:val="24"/>
         </w:rPr>
@@ -4359,6 +4243,7 @@
       <w:r>
         <w:rPr>
           <w:rFonts w:ascii="Times New Roman" w:eastAsia="Times New Roman" w:hAnsi="Times New Roman" w:cs="Times New Roman"/>
+          <w:noProof/>
           <w:sz w:val="24"/>
           <w:szCs w:val="24"/>
         </w:rPr>
@@ -4513,15 +4398,7 @@
         <w:t>Step 3:</w:t>
       </w:r>
       <w:r>
-        <w:t xml:space="preserve"> The application will automatically fetch live exchange rates from the </w:t>
-      </w:r>
-      <w:proofErr w:type="spellStart"/>
-      <w:r>
-        <w:t>ExchangeRate</w:t>
-      </w:r>
-      <w:proofErr w:type="spellEnd"/>
-      <w:r>
-        <w:t>-API in the background. Wait a moment for the currency dropdowns to populate with all available currencies and flag icons</w:t>
+        <w:t xml:space="preserve"> The application will automatically fetch live exchange rates from the ExchangeRate-API in the background. Wait a moment for the currency dropdowns to populate with all available currencies and flag icons</w:t>
       </w:r>
     </w:p>
     <w:p>
@@ -4728,15 +4605,7 @@
         <w:t>Note:</w:t>
       </w:r>
       <w:r>
-        <w:t xml:space="preserve"> A stable internet connection is required when launching the application to fetch exchange rates. All conversions use USD as the base currency reference provided by the </w:t>
-      </w:r>
-      <w:proofErr w:type="spellStart"/>
-      <w:r>
-        <w:t>ExchangeRate</w:t>
-      </w:r>
-      <w:proofErr w:type="spellEnd"/>
-      <w:r>
-        <w:t>-API. The application requires a one-time internet connection to fetch rates at startup, but conversion calculations are performed locally and do not require additional internet access.</w:t>
+        <w:t xml:space="preserve"> A stable internet connection is required when launching the application to fetch exchange rates. All conversions use USD as the base currency reference provided by the ExchangeRate-API. The application requires a one-time internet connection to fetch rates at startup, but conversion calculations are performed locally and do not require additional internet access.</w:t>
       </w:r>
     </w:p>
     <w:p>
@@ -4878,18 +4747,44 @@
         </w:rPr>
         <w:t xml:space="preserve">-API Documentation - </w:t>
       </w:r>
-      <w:hyperlink r:id="rId15" w:history="1">
-        <w:r>
-          <w:rPr>
-            <w:rStyle w:val="Hyperlink"/>
-            <w:rFonts w:ascii="Times New Roman" w:eastAsia="Times New Roman" w:hAnsi="Times New Roman" w:cs="Times New Roman"/>
-            <w:sz w:val="24"/>
-            <w:szCs w:val="24"/>
-            <w:lang w:val="fr-FR"/>
-          </w:rPr>
-          <w:t>https://www.exchangerate-api.com/</w:t>
-        </w:r>
-      </w:hyperlink>
+      <w:r>
+        <w:fldChar w:fldCharType="begin"/>
+      </w:r>
+      <w:r>
+        <w:rPr>
+          <w:lang w:val="fr-FR"/>
+        </w:rPr>
+        <w:instrText xml:space="preserve"> HYPERLINK "https://www</w:instrText>
+      </w:r>
+      <w:r>
+        <w:rPr>
+          <w:lang w:val="fr-FR"/>
+        </w:rPr>
+        <w:instrText xml:space="preserve">.exchangerate-api.com/" </w:instrText>
+      </w:r>
+      <w:r>
+        <w:fldChar w:fldCharType="separate"/>
+      </w:r>
+      <w:r>
+        <w:rPr>
+          <w:rStyle w:val="Hyperlink"/>
+          <w:rFonts w:ascii="Times New Roman" w:eastAsia="Times New Roman" w:hAnsi="Times New Roman" w:cs="Times New Roman"/>
+          <w:sz w:val="24"/>
+          <w:szCs w:val="24"/>
+          <w:lang w:val="fr-FR"/>
+        </w:rPr>
+        <w:t>https://www.exchangerate-api.com/</w:t>
+      </w:r>
+      <w:r>
+        <w:rPr>
+          <w:rStyle w:val="Hyperlink"/>
+          <w:rFonts w:ascii="Times New Roman" w:eastAsia="Times New Roman" w:hAnsi="Times New Roman" w:cs="Times New Roman"/>
+          <w:sz w:val="24"/>
+          <w:szCs w:val="24"/>
+          <w:lang w:val="fr-FR"/>
+        </w:rPr>
+        <w:fldChar w:fldCharType="end"/>
+      </w:r>
       <w:r>
         <w:rPr>
           <w:rFonts w:ascii="Times New Roman" w:eastAsia="Times New Roman" w:hAnsi="Times New Roman" w:cs="Times New Roman"/>
@@ -4923,27 +4818,9 @@
           <w:sz w:val="24"/>
           <w:szCs w:val="24"/>
         </w:rPr>
-        <w:t xml:space="preserve">Open </w:t>
-      </w:r>
-      <w:proofErr w:type="spellStart"/>
-      <w:r>
-        <w:rPr>
-          <w:rFonts w:ascii="Times New Roman" w:eastAsia="Times New Roman" w:hAnsi="Times New Roman" w:cs="Times New Roman"/>
-          <w:sz w:val="24"/>
-          <w:szCs w:val="24"/>
-        </w:rPr>
-        <w:t>ExchangeRate</w:t>
-      </w:r>
-      <w:proofErr w:type="spellEnd"/>
-      <w:r>
-        <w:rPr>
-          <w:rFonts w:ascii="Times New Roman" w:eastAsia="Times New Roman" w:hAnsi="Times New Roman" w:cs="Times New Roman"/>
-          <w:sz w:val="24"/>
-          <w:szCs w:val="24"/>
-        </w:rPr>
-        <w:t xml:space="preserve">-API - </w:t>
-      </w:r>
-      <w:hyperlink r:id="rId16" w:history="1">
+        <w:t xml:space="preserve">Open ExchangeRate-API - </w:t>
+      </w:r>
+      <w:hyperlink r:id="rId15" w:history="1">
         <w:r>
           <w:rPr>
             <w:rStyle w:val="Hyperlink"/>
@@ -5007,7 +4884,7 @@
         </w:rPr>
         <w:t xml:space="preserve"> Documentation - </w:t>
       </w:r>
-      <w:hyperlink r:id="rId17" w:history="1">
+      <w:hyperlink r:id="rId16" w:history="1">
         <w:r>
           <w:rPr>
             <w:rStyle w:val="Hyperlink"/>
@@ -5053,7 +4930,7 @@
         </w:rPr>
         <w:t xml:space="preserve">Java Swing Documentation - </w:t>
       </w:r>
-      <w:hyperlink r:id="rId18" w:history="1">
+      <w:hyperlink r:id="rId17" w:history="1">
         <w:r>
           <w:rPr>
             <w:rStyle w:val="Hyperlink"/>
@@ -5097,7 +4974,7 @@
         </w:rPr>
         <w:t xml:space="preserve">JSON Processing in Java - </w:t>
       </w:r>
-      <w:hyperlink r:id="rId19" w:history="1">
+      <w:hyperlink r:id="rId18" w:history="1">
         <w:r>
           <w:rPr>
             <w:rStyle w:val="Hyperlink"/>
@@ -5139,7 +5016,7 @@
         </w:rPr>
         <w:t xml:space="preserve">Wikipedia - Exchange Rate - </w:t>
       </w:r>
-      <w:hyperlink r:id="rId20" w:history="1">
+      <w:hyperlink r:id="rId19" w:history="1">
         <w:r>
           <w:rPr>
             <w:rStyle w:val="Hyperlink"/>
@@ -5179,7 +5056,7 @@
         </w:rPr>
         <w:t xml:space="preserve">Maven Project Management - </w:t>
       </w:r>
-      <w:hyperlink r:id="rId21" w:history="1">
+      <w:hyperlink r:id="rId20" w:history="1">
         <w:r>
           <w:rPr>
             <w:rStyle w:val="Hyperlink"/>

</xml_diff>